<commit_message>
adding new figures to markdown
</commit_message>
<xml_diff>
--- a/Rmarkdown/multivariate_analysis.docx
+++ b/Rmarkdown/multivariate_analysis.docx
@@ -84,7 +84,15 @@
         <w:t xml:space="preserve">Dougherty</w:t>
       </w:r>
     </w:p>
-    <w:bookmarkStart w:id="33" w:name="X13c125c35ad9c5fbc50b2a69ca84bcfc7c37469"/>
+    <w:p>
+      <w:pPr>
+        <w:pStyle w:val="FirstParagraph"/>
+      </w:pPr>
+      <w:r>
+        <w:t xml:space="preserve">This documents the exploratory multivariate meta-analysis for the effects of temperature on the longevity and reproduction of species.</w:t>
+      </w:r>
+    </w:p>
+    <w:bookmarkStart w:id="31" w:name="X13c125c35ad9c5fbc50b2a69ca84bcfc7c37469"/>
     <w:p>
       <w:pPr>
         <w:pStyle w:val="Heading1"/>
@@ -184,12 +192,12 @@
         </w:r>
       </w:hyperlink>
       <w:r>
-        <w:t xml:space="preserve">), with effect magnitude and direction changing non-linearly with temperature increases (FAY, MAYBE ADD FIG). Interestingly, studies that observed larger changes in reprodcution also observed correlated changes in longevity (between study correlation = 0.37), however, at the within study-level there was a much weaker correlation (within-study correlation = 0.17,</w:t>
+        <w:t xml:space="preserve">), with effect magnitude and direction changing non-linearly with temperature increases. Interestingly, studies that observed larger changes in reprodcution also observed correlated changes in longevity (between study correlation = 0.37), however, at the within study-level there was a much weaker correlation (within-study correlation = 0.17,</w:t>
       </w:r>
       <w:r>
         <w:t xml:space="preserve"> </w:t>
       </w:r>
-      <w:hyperlink w:anchor="fig-fig2">
+      <w:hyperlink w:anchor="fig-study-correlation">
         <w:r>
           <w:rPr>
             <w:rStyle w:val="Hyperlink"/>
@@ -3249,12 +3257,13 @@
       <w:tr>
         <w:tc>
           <w:tcPr/>
-          <w:bookmarkStart w:id="28" w:name="fig-fig2"/>
+          <w:bookmarkStart w:id="29" w:name="fig-study-correlation"/>
           <w:p>
             <w:pPr>
               <w:pStyle w:val="Compact"/>
               <w:jc w:val="center"/>
             </w:pPr>
+            <w:bookmarkStart w:id="28" w:name="fig-study-correlation"/>
             <w:r>
               <w:drawing>
                 <wp:inline>
@@ -3265,7 +3274,7 @@
                     <a:graphicData uri="http://schemas.openxmlformats.org/drawingml/2006/picture">
                       <pic:pic>
                         <pic:nvPicPr>
-                          <pic:cNvPr descr="multivariate_analysis_files/figure-docx/fig-fig2-1.png" id="27" name="Picture"/>
+                          <pic:cNvPr descr="multivariate_analysis_files/figure-docx/fig-study-correlation-1.png" id="27" name="Picture"/>
                           <pic:cNvPicPr>
                             <a:picLocks noChangeArrowheads="1" noChangeAspect="1"/>
                           </pic:cNvPicPr>
@@ -3297,6 +3306,7 @@
                 </wp:inline>
               </w:drawing>
             </w:r>
+            <w:bookmarkEnd w:id="28"/>
           </w:p>
           <w:p>
             <w:pPr>
@@ -3308,97 +3318,17 @@
               <w:pStyle w:val="ImageCaption"/>
             </w:pPr>
             <w:r>
-              <w:t xml:space="preserve">Figure 2- Between study correlation for reproduction and longevity</w:t>
+              <w:t xml:space="preserve">Figure 2</w:t>
             </w:r>
           </w:p>
-          <w:bookmarkEnd w:id="28"/>
+          <w:bookmarkEnd w:id="29"/>
         </w:tc>
       </w:tr>
     </w:tbl>
-    <w:tbl>
-      <w:tblPr>
-        <w:tblStyle w:val="Table"/>
-        <w:tblW w:type="pct" w:w="5000"/>
-        <w:tblLayout w:type="fixed"/>
-        <w:tblLook w:firstRow="0" w:lastRow="0" w:firstColumn="0" w:lastColumn="0" w:noHBand="0" w:noVBand="0" w:val="0000"/>
-      </w:tblPr>
-      <w:tblGrid>
-        <w:gridCol w:w="7920"/>
-      </w:tblGrid>
-      <w:tr>
-        <w:tc>
-          <w:tcPr/>
-          <w:bookmarkStart w:id="32" w:name="fig-fig3"/>
-          <w:p>
-            <w:pPr>
-              <w:pStyle w:val="Compact"/>
-              <w:jc w:val="center"/>
-            </w:pPr>
-            <w:r>
-              <w:drawing>
-                <wp:inline>
-                  <wp:extent cx="5334000" cy="4267200"/>
-                  <wp:effectExtent b="0" l="0" r="0" t="0"/>
-                  <wp:docPr descr="" title="" id="30" name="Picture"/>
-                  <a:graphic>
-                    <a:graphicData uri="http://schemas.openxmlformats.org/drawingml/2006/picture">
-                      <pic:pic>
-                        <pic:nvPicPr>
-                          <pic:cNvPr descr="multivariate_analysis_files/figure-docx/fig-fig3-1.png" id="31" name="Picture"/>
-                          <pic:cNvPicPr>
-                            <a:picLocks noChangeArrowheads="1" noChangeAspect="1"/>
-                          </pic:cNvPicPr>
-                        </pic:nvPicPr>
-                        <pic:blipFill>
-                          <a:blip r:embed="rId29"/>
-                          <a:stretch>
-                            <a:fillRect/>
-                          </a:stretch>
-                        </pic:blipFill>
-                        <pic:spPr bwMode="auto">
-                          <a:xfrm>
-                            <a:off x="0" y="0"/>
-                            <a:ext cx="5334000" cy="4267200"/>
-                          </a:xfrm>
-                          <a:prstGeom prst="rect">
-                            <a:avLst/>
-                          </a:prstGeom>
-                          <a:noFill/>
-                          <a:ln w="9525">
-                            <a:noFill/>
-                            <a:headEnd/>
-                            <a:tailEnd/>
-                          </a:ln>
-                        </pic:spPr>
-                      </pic:pic>
-                    </a:graphicData>
-                  </a:graphic>
-                </wp:inline>
-              </w:drawing>
-            </w:r>
-          </w:p>
-          <w:p>
-            <w:pPr>
-              <w:jc w:val="center"/>
-            </w:pPr>
-            <w:pPr>
-              <w:jc w:val="start"/>
-              <w:spacing w:before="200"/>
-              <w:pStyle w:val="ImageCaption"/>
-            </w:pPr>
-            <w:r>
-              <w:t xml:space="preserve">Figure 3- Zoomed Between study correlation for reproduction and longevity</w:t>
-            </w:r>
-          </w:p>
-          <w:bookmarkEnd w:id="32"/>
-        </w:tc>
-      </w:tr>
-    </w:tbl>
-    <w:bookmarkEnd w:id="33"/>
-    <w:bookmarkStart w:id="36" w:name="sensitivity-analysis"/>
+    <w:bookmarkStart w:id="30" w:name="sensitivity-analysis"/>
     <w:p>
       <w:pPr>
-        <w:pStyle w:val="Heading1"/>
+        <w:pStyle w:val="Heading2"/>
       </w:pPr>
       <w:r>
         <w:t xml:space="preserve">Sensitivity Analysis</w:t>
@@ -3409,15 +3339,7 @@
         <w:pStyle w:val="FirstParagraph"/>
       </w:pPr>
       <w:r>
-        <w:t xml:space="preserve">This removes any effect sizes above 10 or below -10. The plot above shows only the experiments that have outlying effect sizes not the specific effect size itself.</w:t>
-      </w:r>
-    </w:p>
-    <w:p>
-      <w:pPr>
-        <w:pStyle w:val="BodyText"/>
-      </w:pPr>
-      <w:r>
-        <w:t xml:space="preserve">When removing the 10% largest and smallest effect sizes, the following effect sizes are removed.</w:t>
+        <w:t xml:space="preserve">In this analysis we remove any effect sizes above 10 or below -10. When removing the 10% largest and smallest effect sizes, the following effect sizes are removed.</w:t>
       </w:r>
     </w:p>
     <w:p>
@@ -3449,21 +3371,47 @@
         <w:t xml:space="preserve">21976 Levels: HUM109A.-26 HUM148A.-26 HUM22B.-26 HUM256A.-26 ... TEMP995A.21</w:t>
       </w:r>
     </w:p>
-    <w:bookmarkStart w:id="35" w:name="splitting-analysis-warm-versus-cool"/>
+    <w:bookmarkEnd w:id="30"/>
+    <w:bookmarkEnd w:id="31"/>
+    <w:bookmarkStart w:id="32" w:name="splitting-analysis-warm-versus-cool"/>
     <w:p>
       <w:pPr>
-        <w:pStyle w:val="Heading3"/>
+        <w:pStyle w:val="Heading1"/>
       </w:pPr>
       <w:r>
         <w:t xml:space="preserve">Splitting analysis: warm versus cool</w:t>
       </w:r>
+    </w:p>
+    <w:bookmarkEnd w:id="32"/>
+    <w:bookmarkStart w:id="44" w:name="section"/>
+    <w:p>
+      <w:pPr>
+        <w:pStyle w:val="Heading1"/>
+      </w:pPr>
     </w:p>
     <w:p>
       <w:pPr>
         <w:pStyle w:val="FirstParagraph"/>
       </w:pPr>
       <w:r>
-        <w:t xml:space="preserve">There was a significant and negative linear effect of temperature on both reproduction and adult lifespan at warmer temperatures (-0.17 and -0.38 respectively, see Table 3 for estimates). However, reproductive traits were more strongly impacted by increased temperature changes than adult lifespan (contrast = -0.21, 95% CI: -0.26 to -0.16, df = 786,</w:t>
+        <w:t xml:space="preserve">In this analysis we split the dataset into studies warmer and cooler than the reference temperature of 25 degrees C. Here we explored non-linear effects up to degree 4. We found that there was a significant and negative linear effect of temperature on both reproduction and adult lifespan at warmer temperatures (-0.17 and -0.38 respectively, (Table</w:t>
+      </w:r>
+      <w:r>
+        <w:t xml:space="preserve"> </w:t>
+      </w:r>
+      <w:hyperlink w:anchor="tbl-warm-lin">
+        <w:r>
+          <w:rPr>
+            <w:rStyle w:val="Hyperlink"/>
+          </w:rPr>
+          <w:t xml:space="preserve">Table 2</w:t>
+        </w:r>
+      </w:hyperlink>
+      <w:r>
+        <w:t xml:space="preserve"> </w:t>
+      </w:r>
+      <w:r>
+        <w:t xml:space="preserve">). However, reproductive traits were more strongly impacted by increased temperature changes than adult lifespan (contrast = -0.21, 95% CI: -0.26 to -0.16, df = 786,</w:t>
       </w:r>
       <w:r>
         <w:t xml:space="preserve"> </w:t>
@@ -3489,7 +3437,24 @@
         <w:t xml:space="preserve">p</w:t>
       </w:r>
       <w:r>
-        <w:t xml:space="preserve">-value = &lt; 0.0001). Figure 5 shows the predicted linear effects of temperature on reproduction and adult lifespan for observed treatment temperatures warmer than their reference temperature.</w:t>
+        <w:t xml:space="preserve">-value = &lt; 0.0001). Figure</w:t>
+      </w:r>
+      <w:r>
+        <w:t xml:space="preserve"> </w:t>
+      </w:r>
+      <w:hyperlink w:anchor="X8706c464d11955dbc28256a1cac660d8615fa6c">
+        <w:r>
+          <w:rPr>
+            <w:rStyle w:val="Hyperlink"/>
+          </w:rPr>
+          <w:t xml:space="preserve">Figure 3</w:t>
+        </w:r>
+      </w:hyperlink>
+      <w:r>
+        <w:t xml:space="preserve"> </w:t>
+      </w:r>
+      <w:r>
+        <w:t xml:space="preserve">models models shows the predicted linear effects of temperature on reproduction and adult lifespan for observed treatment temperatures warmer than their reference temperature.</w:t>
       </w:r>
     </w:p>
     <w:p>
@@ -3497,7 +3462,24 @@
         <w:pStyle w:val="BodyText"/>
       </w:pPr>
       <w:r>
-        <w:t xml:space="preserve">Interestingly, Figure 6 shows that studies which observed larger changes in reproduction also observed correlated changes in longevity (between study correlation = 0.65, 95% CI: 0.52 to 0.75), however, at the within study-level there was a much weaker correlation (within-study correlation = 0.5, 95% CI: 0.38 to 0.61)</w:t>
+        <w:t xml:space="preserve">Interestingly, Figure</w:t>
+      </w:r>
+      <w:r>
+        <w:t xml:space="preserve"> </w:t>
+      </w:r>
+      <w:hyperlink w:anchor="fig-between-study-correlation-warm-cool">
+        <w:r>
+          <w:rPr>
+            <w:rStyle w:val="Hyperlink"/>
+          </w:rPr>
+          <w:t xml:space="preserve">Figure 4</w:t>
+        </w:r>
+      </w:hyperlink>
+      <w:r>
+        <w:t xml:space="preserve"> </w:t>
+      </w:r>
+      <w:r>
+        <w:t xml:space="preserve">shows that studies which observed larger changes in reproduction also observed correlated changes in longevity (between study correlation = 0.65, 95% CI: 0.52 to 0.75), however, at the within study-level there was a much weaker correlation (within-study correlation = 0.5, 95% CI: 0.38 to 0.61)</w:t>
       </w:r>
     </w:p>
     <w:tbl>
@@ -3513,7 +3495,7 @@
       <w:tr>
         <w:tc>
           <w:tcPr/>
-          <w:bookmarkStart w:id="34" w:name="tbl-warm-lin"/>
+          <w:bookmarkStart w:id="33" w:name="tbl-warm-lin"/>
           <w:p>
             <w:pPr>
               <w:jc w:val="center"/>
@@ -3524,7 +3506,7 @@
               <w:pStyle w:val="ImageCaption"/>
             </w:pPr>
             <w:r>
-              <w:t xml:space="preserve">Table 2- Linear effects of temperature on mean effect size for longevity and reproduction when treatment temperatures are warmer than reference temperatures.</w:t>
+              <w:t xml:space="preserve">Table 2</w:t>
             </w:r>
           </w:p>
           <w:tbl xmlns:w="http://schemas.openxmlformats.org/wordprocessingml/2006/main" xmlns:r="http://schemas.openxmlformats.org/officeDocument/2006/relationships" xmlns:w14="http://schemas.microsoft.com/office/word/2010/wordml" xmlns:wp="http://schemas.openxmlformats.org/drawingml/2006/wordprocessingDrawing" xmlns:a="http://schemas.openxmlformats.org/drawingml/2006/main" xmlns:pic="http://schemas.openxmlformats.org/drawingml/2006/picture">
@@ -5156,13 +5138,174 @@
               </w:tc>
             </w:tr>
           </w:tbl>
-          <w:bookmarkEnd w:id="34"/>
+          <w:bookmarkEnd w:id="33"/>
         </w:tc>
       </w:tr>
     </w:tbl>
-    <w:bookmarkEnd w:id="35"/>
-    <w:bookmarkEnd w:id="36"/>
-    <w:bookmarkStart w:id="62" w:name="cool-analysis"/>
+    <w:tbl>
+      <w:tblPr>
+        <w:tblStyle w:val="Table"/>
+        <w:tblW w:type="pct" w:w="5000"/>
+        <w:tblLayout w:type="fixed"/>
+        <w:tblLook w:firstRow="0" w:lastRow="0" w:firstColumn="0" w:lastColumn="0" w:noHBand="0" w:noVBand="0" w:val="0000"/>
+      </w:tblPr>
+      <w:tblGrid>
+        <w:gridCol w:w="7920"/>
+      </w:tblGrid>
+      <w:tr>
+        <w:tc>
+          <w:tcPr/>
+          <w:bookmarkStart w:id="38" w:name="X8706c464d11955dbc28256a1cac660d8615fa6c"/>
+          <w:p>
+            <w:pPr>
+              <w:pStyle w:val="Compact"/>
+              <w:jc w:val="center"/>
+            </w:pPr>
+            <w:bookmarkStart w:id="37" w:name="X8706c464d11955dbc28256a1cac660d8615fa6c"/>
+            <w:r>
+              <w:drawing>
+                <wp:inline>
+                  <wp:extent cx="5334000" cy="4267200"/>
+                  <wp:effectExtent b="0" l="0" r="0" t="0"/>
+                  <wp:docPr descr="" title="" id="35" name="Picture"/>
+                  <a:graphic>
+                    <a:graphicData uri="http://schemas.openxmlformats.org/drawingml/2006/picture">
+                      <pic:pic>
+                        <pic:nvPicPr>
+                          <pic:cNvPr descr="multivariate_analysis_files/figure-docx/fig-prediction-ints-mv_mlma-warmcool-linear-1.png" id="36" name="Picture"/>
+                          <pic:cNvPicPr>
+                            <a:picLocks noChangeArrowheads="1" noChangeAspect="1"/>
+                          </pic:cNvPicPr>
+                        </pic:nvPicPr>
+                        <pic:blipFill>
+                          <a:blip r:embed="rId34"/>
+                          <a:stretch>
+                            <a:fillRect/>
+                          </a:stretch>
+                        </pic:blipFill>
+                        <pic:spPr bwMode="auto">
+                          <a:xfrm>
+                            <a:off x="0" y="0"/>
+                            <a:ext cx="5334000" cy="4267200"/>
+                          </a:xfrm>
+                          <a:prstGeom prst="rect">
+                            <a:avLst/>
+                          </a:prstGeom>
+                          <a:noFill/>
+                          <a:ln w="9525">
+                            <a:noFill/>
+                            <a:headEnd/>
+                            <a:tailEnd/>
+                          </a:ln>
+                        </pic:spPr>
+                      </pic:pic>
+                    </a:graphicData>
+                  </a:graphic>
+                </wp:inline>
+              </w:drawing>
+            </w:r>
+            <w:bookmarkEnd w:id="37"/>
+          </w:p>
+          <w:p>
+            <w:pPr>
+              <w:jc w:val="center"/>
+            </w:pPr>
+            <w:pPr>
+              <w:jc w:val="start"/>
+              <w:spacing w:before="200"/>
+              <w:pStyle w:val="ImageCaption"/>
+            </w:pPr>
+            <w:r>
+              <w:t xml:space="preserve">Figure 3</w:t>
+            </w:r>
+          </w:p>
+          <w:bookmarkEnd w:id="38"/>
+        </w:tc>
+      </w:tr>
+    </w:tbl>
+    <w:tbl>
+      <w:tblPr>
+        <w:tblStyle w:val="Table"/>
+        <w:tblW w:type="pct" w:w="5000"/>
+        <w:tblLayout w:type="fixed"/>
+        <w:tblLook w:firstRow="0" w:lastRow="0" w:firstColumn="0" w:lastColumn="0" w:noHBand="0" w:noVBand="0" w:val="0000"/>
+      </w:tblPr>
+      <w:tblGrid>
+        <w:gridCol w:w="7920"/>
+      </w:tblGrid>
+      <w:tr>
+        <w:tc>
+          <w:tcPr/>
+          <w:bookmarkStart w:id="43" w:name="fig-between-study-correlation-warm-cool"/>
+          <w:p>
+            <w:pPr>
+              <w:pStyle w:val="Compact"/>
+              <w:jc w:val="center"/>
+            </w:pPr>
+            <w:bookmarkStart w:id="42" w:name="fig-between-study-correlation-warm-cool"/>
+            <w:r>
+              <w:drawing>
+                <wp:inline>
+                  <wp:extent cx="5334000" cy="2133600"/>
+                  <wp:effectExtent b="0" l="0" r="0" t="0"/>
+                  <wp:docPr descr="" title="" id="40" name="Picture"/>
+                  <a:graphic>
+                    <a:graphicData uri="http://schemas.openxmlformats.org/drawingml/2006/picture">
+                      <pic:pic>
+                        <pic:nvPicPr>
+                          <pic:cNvPr descr="multivariate_analysis_files/figure-docx/fig-between-study-correlation-warm-cool-1.png" id="41" name="Picture"/>
+                          <pic:cNvPicPr>
+                            <a:picLocks noChangeArrowheads="1" noChangeAspect="1"/>
+                          </pic:cNvPicPr>
+                        </pic:nvPicPr>
+                        <pic:blipFill>
+                          <a:blip r:embed="rId39"/>
+                          <a:stretch>
+                            <a:fillRect/>
+                          </a:stretch>
+                        </pic:blipFill>
+                        <pic:spPr bwMode="auto">
+                          <a:xfrm>
+                            <a:off x="0" y="0"/>
+                            <a:ext cx="5334000" cy="2133600"/>
+                          </a:xfrm>
+                          <a:prstGeom prst="rect">
+                            <a:avLst/>
+                          </a:prstGeom>
+                          <a:noFill/>
+                          <a:ln w="9525">
+                            <a:noFill/>
+                            <a:headEnd/>
+                            <a:tailEnd/>
+                          </a:ln>
+                        </pic:spPr>
+                      </pic:pic>
+                    </a:graphicData>
+                  </a:graphic>
+                </wp:inline>
+              </w:drawing>
+            </w:r>
+            <w:bookmarkEnd w:id="42"/>
+          </w:p>
+          <w:p>
+            <w:pPr>
+              <w:jc w:val="center"/>
+            </w:pPr>
+            <w:pPr>
+              <w:jc w:val="start"/>
+              <w:spacing w:before="200"/>
+              <w:pStyle w:val="ImageCaption"/>
+            </w:pPr>
+            <w:r>
+              <w:t xml:space="preserve">Figure 4</w:t>
+            </w:r>
+          </w:p>
+          <w:bookmarkEnd w:id="43"/>
+        </w:tc>
+      </w:tr>
+    </w:tbl>
+    <w:bookmarkEnd w:id="44"/>
+    <w:bookmarkStart w:id="57" w:name="cool-analysis"/>
     <w:p>
       <w:pPr>
         <w:pStyle w:val="Heading1"/>
@@ -5217,7 +5360,7 @@
       <w:tr>
         <w:tc>
           <w:tcPr/>
-          <w:bookmarkStart w:id="37" w:name="tbl-cool-quad"/>
+          <w:bookmarkStart w:id="45" w:name="tbl-cool-quad"/>
           <w:p>
             <w:pPr>
               <w:jc w:val="center"/>
@@ -5228,7 +5371,7 @@
               <w:pStyle w:val="ImageCaption"/>
             </w:pPr>
             <w:r>
-              <w:t xml:space="preserve">Table 3- Quadratic effects of temperature on mean effect size for longevity and reproduction when treatment temperatures are cooler than reference temperatures.</w:t>
+              <w:t xml:space="preserve">Table 3</w:t>
             </w:r>
           </w:p>
           <w:tbl xmlns:w="http://schemas.openxmlformats.org/wordprocessingml/2006/main" xmlns:r="http://schemas.openxmlformats.org/officeDocument/2006/relationships" xmlns:w14="http://schemas.microsoft.com/office/word/2010/wordml" xmlns:wp="http://schemas.openxmlformats.org/drawingml/2006/wordprocessingDrawing" xmlns:a="http://schemas.openxmlformats.org/drawingml/2006/main" xmlns:pic="http://schemas.openxmlformats.org/drawingml/2006/picture">
@@ -7508,7 +7651,7 @@
               </w:tc>
             </w:tr>
           </w:tbl>
-          <w:bookmarkEnd w:id="37"/>
+          <w:bookmarkEnd w:id="45"/>
         </w:tc>
       </w:tr>
     </w:tbl>
@@ -7521,318 +7664,18 @@
           <wp:inline>
             <wp:extent cx="5334000" cy="4267200"/>
             <wp:effectExtent b="0" l="0" r="0" t="0"/>
-            <wp:docPr descr="" title="" id="39" name="Picture"/>
+            <wp:docPr descr="" title="" id="47" name="Picture"/>
             <a:graphic>
               <a:graphicData uri="http://schemas.openxmlformats.org/drawingml/2006/picture">
                 <pic:pic>
                   <pic:nvPicPr>
-                    <pic:cNvPr descr="multivariate_analysis_files/figure-docx/fig-%20between-study%20correlation%20for%20reproduction%20and%20longevity-%20split%20into%20warm%20and%20cool-1.png" id="40" name="Picture"/>
+                    <pic:cNvPr descr="multivariate_analysis_files/figure-docx/fig-%20prediction%20intervals%20for%20mv_mlma%20split%20by%20warm.cool-%20cubic%20models-1.png" id="48" name="Picture"/>
                     <pic:cNvPicPr>
                       <a:picLocks noChangeArrowheads="1" noChangeAspect="1"/>
                     </pic:cNvPicPr>
                   </pic:nvPicPr>
                   <pic:blipFill>
-                    <a:blip r:embed="rId38"/>
-                    <a:stretch>
-                      <a:fillRect/>
-                    </a:stretch>
-                  </pic:blipFill>
-                  <pic:spPr bwMode="auto">
-                    <a:xfrm>
-                      <a:off x="0" y="0"/>
-                      <a:ext cx="5334000" cy="4267200"/>
-                    </a:xfrm>
-                    <a:prstGeom prst="rect">
-                      <a:avLst/>
-                    </a:prstGeom>
-                    <a:noFill/>
-                    <a:ln w="9525">
-                      <a:noFill/>
-                      <a:headEnd/>
-                      <a:tailEnd/>
-                    </a:ln>
-                  </pic:spPr>
-                </pic:pic>
-              </a:graphicData>
-            </a:graphic>
-          </wp:inline>
-        </w:drawing>
-      </w:r>
-      <w:r>
-        <w:t xml:space="preserve">{#fig- between-study correlation for reproduction and longevity- split into warm and cool-1}</w:t>
-      </w:r>
-    </w:p>
-    <w:p>
-      <w:pPr>
-        <w:pStyle w:val="BodyText"/>
-      </w:pPr>
-      <w:r>
-        <w:drawing>
-          <wp:inline>
-            <wp:extent cx="5334000" cy="4267200"/>
-            <wp:effectExtent b="0" l="0" r="0" t="0"/>
-            <wp:docPr descr="" title="" id="42" name="Picture"/>
-            <a:graphic>
-              <a:graphicData uri="http://schemas.openxmlformats.org/drawingml/2006/picture">
-                <pic:pic>
-                  <pic:nvPicPr>
-                    <pic:cNvPr descr="multivariate_analysis_files/figure-docx/fig-%20between-study%20correlation%20for%20reproduction%20and%20longevity-%20split%20into%20warm%20and%20cool-2.png" id="43" name="Picture"/>
-                    <pic:cNvPicPr>
-                      <a:picLocks noChangeArrowheads="1" noChangeAspect="1"/>
-                    </pic:cNvPicPr>
-                  </pic:nvPicPr>
-                  <pic:blipFill>
-                    <a:blip r:embed="rId41"/>
-                    <a:stretch>
-                      <a:fillRect/>
-                    </a:stretch>
-                  </pic:blipFill>
-                  <pic:spPr bwMode="auto">
-                    <a:xfrm>
-                      <a:off x="0" y="0"/>
-                      <a:ext cx="5334000" cy="4267200"/>
-                    </a:xfrm>
-                    <a:prstGeom prst="rect">
-                      <a:avLst/>
-                    </a:prstGeom>
-                    <a:noFill/>
-                    <a:ln w="9525">
-                      <a:noFill/>
-                      <a:headEnd/>
-                      <a:tailEnd/>
-                    </a:ln>
-                  </pic:spPr>
-                </pic:pic>
-              </a:graphicData>
-            </a:graphic>
-          </wp:inline>
-        </w:drawing>
-      </w:r>
-      <w:r>
-        <w:t xml:space="preserve">{#fig- between-study correlation for reproduction and longevity- split into warm and cool-2}</w:t>
-      </w:r>
-    </w:p>
-    <w:p>
-      <w:pPr>
-        <w:pStyle w:val="BodyText"/>
-      </w:pPr>
-      <w:r>
-        <w:drawing>
-          <wp:inline>
-            <wp:extent cx="5334000" cy="4267200"/>
-            <wp:effectExtent b="0" l="0" r="0" t="0"/>
-            <wp:docPr descr="" title="" id="45" name="Picture"/>
-            <a:graphic>
-              <a:graphicData uri="http://schemas.openxmlformats.org/drawingml/2006/picture">
-                <pic:pic>
-                  <pic:nvPicPr>
-                    <pic:cNvPr descr="multivariate_analysis_files/figure-docx/fig-%20prediction%20intervals%20for%20mv_mlma%20split%20by%20warm.cool-%20linear%20models-1.png" id="46" name="Picture"/>
-                    <pic:cNvPicPr>
-                      <a:picLocks noChangeArrowheads="1" noChangeAspect="1"/>
-                    </pic:cNvPicPr>
-                  </pic:nvPicPr>
-                  <pic:blipFill>
-                    <a:blip r:embed="rId44"/>
-                    <a:stretch>
-                      <a:fillRect/>
-                    </a:stretch>
-                  </pic:blipFill>
-                  <pic:spPr bwMode="auto">
-                    <a:xfrm>
-                      <a:off x="0" y="0"/>
-                      <a:ext cx="5334000" cy="4267200"/>
-                    </a:xfrm>
-                    <a:prstGeom prst="rect">
-                      <a:avLst/>
-                    </a:prstGeom>
-                    <a:noFill/>
-                    <a:ln w="9525">
-                      <a:noFill/>
-                      <a:headEnd/>
-                      <a:tailEnd/>
-                    </a:ln>
-                  </pic:spPr>
-                </pic:pic>
-              </a:graphicData>
-            </a:graphic>
-          </wp:inline>
-        </w:drawing>
-      </w:r>
-      <w:r>
-        <w:t xml:space="preserve">{#fig- prediction intervals for mv_mlma split by warm.cool- linear models-1}</w:t>
-      </w:r>
-    </w:p>
-    <w:p>
-      <w:pPr>
-        <w:pStyle w:val="BodyText"/>
-      </w:pPr>
-      <w:r>
-        <w:drawing>
-          <wp:inline>
-            <wp:extent cx="5334000" cy="4267200"/>
-            <wp:effectExtent b="0" l="0" r="0" t="0"/>
-            <wp:docPr descr="" title="" id="48" name="Picture"/>
-            <a:graphic>
-              <a:graphicData uri="http://schemas.openxmlformats.org/drawingml/2006/picture">
-                <pic:pic>
-                  <pic:nvPicPr>
-                    <pic:cNvPr descr="multivariate_analysis_files/figure-docx/fig-%20prediction%20intervals%20for%20mv_mlma%20split%20by%20warm.cool-%20linear%20models-2.png" id="49" name="Picture"/>
-                    <pic:cNvPicPr>
-                      <a:picLocks noChangeArrowheads="1" noChangeAspect="1"/>
-                    </pic:cNvPicPr>
-                  </pic:nvPicPr>
-                  <pic:blipFill>
-                    <a:blip r:embed="rId47"/>
-                    <a:stretch>
-                      <a:fillRect/>
-                    </a:stretch>
-                  </pic:blipFill>
-                  <pic:spPr bwMode="auto">
-                    <a:xfrm>
-                      <a:off x="0" y="0"/>
-                      <a:ext cx="5334000" cy="4267200"/>
-                    </a:xfrm>
-                    <a:prstGeom prst="rect">
-                      <a:avLst/>
-                    </a:prstGeom>
-                    <a:noFill/>
-                    <a:ln w="9525">
-                      <a:noFill/>
-                      <a:headEnd/>
-                      <a:tailEnd/>
-                    </a:ln>
-                  </pic:spPr>
-                </pic:pic>
-              </a:graphicData>
-            </a:graphic>
-          </wp:inline>
-        </w:drawing>
-      </w:r>
-      <w:r>
-        <w:t xml:space="preserve">{#fig- prediction intervals for mv_mlma split by warm.cool- linear models-2}</w:t>
-      </w:r>
-    </w:p>
-    <w:p>
-      <w:pPr>
-        <w:pStyle w:val="BodyText"/>
-      </w:pPr>
-      <w:r>
-        <w:drawing>
-          <wp:inline>
-            <wp:extent cx="5334000" cy="4267200"/>
-            <wp:effectExtent b="0" l="0" r="0" t="0"/>
-            <wp:docPr descr="" title="" id="51" name="Picture"/>
-            <a:graphic>
-              <a:graphicData uri="http://schemas.openxmlformats.org/drawingml/2006/picture">
-                <pic:pic>
-                  <pic:nvPicPr>
-                    <pic:cNvPr descr="multivariate_analysis_files/figure-docx/fig-%20prediction%20intervals%20for%20mv_mlma%20split%20by%20warm.cool-%20quadratic%20models-1.png" id="52" name="Picture"/>
-                    <pic:cNvPicPr>
-                      <a:picLocks noChangeArrowheads="1" noChangeAspect="1"/>
-                    </pic:cNvPicPr>
-                  </pic:nvPicPr>
-                  <pic:blipFill>
-                    <a:blip r:embed="rId50"/>
-                    <a:stretch>
-                      <a:fillRect/>
-                    </a:stretch>
-                  </pic:blipFill>
-                  <pic:spPr bwMode="auto">
-                    <a:xfrm>
-                      <a:off x="0" y="0"/>
-                      <a:ext cx="5334000" cy="4267200"/>
-                    </a:xfrm>
-                    <a:prstGeom prst="rect">
-                      <a:avLst/>
-                    </a:prstGeom>
-                    <a:noFill/>
-                    <a:ln w="9525">
-                      <a:noFill/>
-                      <a:headEnd/>
-                      <a:tailEnd/>
-                    </a:ln>
-                  </pic:spPr>
-                </pic:pic>
-              </a:graphicData>
-            </a:graphic>
-          </wp:inline>
-        </w:drawing>
-      </w:r>
-      <w:r>
-        <w:t xml:space="preserve">{#fig- prediction intervals for mv_mlma split by warm.cool- quadratic models-1}</w:t>
-      </w:r>
-    </w:p>
-    <w:p>
-      <w:pPr>
-        <w:pStyle w:val="BodyText"/>
-      </w:pPr>
-      <w:r>
-        <w:drawing>
-          <wp:inline>
-            <wp:extent cx="5334000" cy="4267200"/>
-            <wp:effectExtent b="0" l="0" r="0" t="0"/>
-            <wp:docPr descr="" title="" id="54" name="Picture"/>
-            <a:graphic>
-              <a:graphicData uri="http://schemas.openxmlformats.org/drawingml/2006/picture">
-                <pic:pic>
-                  <pic:nvPicPr>
-                    <pic:cNvPr descr="multivariate_analysis_files/figure-docx/fig-%20prediction%20intervals%20for%20mv_mlma%20split%20by%20warm.cool-%20quadratic%20models-2.png" id="55" name="Picture"/>
-                    <pic:cNvPicPr>
-                      <a:picLocks noChangeArrowheads="1" noChangeAspect="1"/>
-                    </pic:cNvPicPr>
-                  </pic:nvPicPr>
-                  <pic:blipFill>
-                    <a:blip r:embed="rId53"/>
-                    <a:stretch>
-                      <a:fillRect/>
-                    </a:stretch>
-                  </pic:blipFill>
-                  <pic:spPr bwMode="auto">
-                    <a:xfrm>
-                      <a:off x="0" y="0"/>
-                      <a:ext cx="5334000" cy="4267200"/>
-                    </a:xfrm>
-                    <a:prstGeom prst="rect">
-                      <a:avLst/>
-                    </a:prstGeom>
-                    <a:noFill/>
-                    <a:ln w="9525">
-                      <a:noFill/>
-                      <a:headEnd/>
-                      <a:tailEnd/>
-                    </a:ln>
-                  </pic:spPr>
-                </pic:pic>
-              </a:graphicData>
-            </a:graphic>
-          </wp:inline>
-        </w:drawing>
-      </w:r>
-      <w:r>
-        <w:t xml:space="preserve">{#fig- prediction intervals for mv_mlma split by warm.cool- quadratic models-2}</w:t>
-      </w:r>
-    </w:p>
-    <w:p>
-      <w:pPr>
-        <w:pStyle w:val="BodyText"/>
-      </w:pPr>
-      <w:r>
-        <w:drawing>
-          <wp:inline>
-            <wp:extent cx="5334000" cy="4267200"/>
-            <wp:effectExtent b="0" l="0" r="0" t="0"/>
-            <wp:docPr descr="" title="" id="57" name="Picture"/>
-            <a:graphic>
-              <a:graphicData uri="http://schemas.openxmlformats.org/drawingml/2006/picture">
-                <pic:pic>
-                  <pic:nvPicPr>
-                    <pic:cNvPr descr="multivariate_analysis_files/figure-docx/fig-%20prediction%20intervals%20for%20mv_mlma%20split%20by%20warm.cool-%20cubic%20models-1.png" id="58" name="Picture"/>
-                    <pic:cNvPicPr>
-                      <a:picLocks noChangeArrowheads="1" noChangeAspect="1"/>
-                    </pic:cNvPicPr>
-                  </pic:nvPicPr>
-                  <pic:blipFill>
-                    <a:blip r:embed="rId56"/>
+                    <a:blip r:embed="rId46"/>
                     <a:stretch>
                       <a:fillRect/>
                     </a:stretch>
@@ -7871,18 +7714,18 @@
           <wp:inline>
             <wp:extent cx="5334000" cy="4267200"/>
             <wp:effectExtent b="0" l="0" r="0" t="0"/>
-            <wp:docPr descr="" title="" id="60" name="Picture"/>
+            <wp:docPr descr="" title="" id="50" name="Picture"/>
             <a:graphic>
               <a:graphicData uri="http://schemas.openxmlformats.org/drawingml/2006/picture">
                 <pic:pic>
                   <pic:nvPicPr>
-                    <pic:cNvPr descr="multivariate_analysis_files/figure-docx/fig-%20prediction%20intervals%20for%20mv_mlma%20split%20by%20warm.cool-%20cubic%20models-2.png" id="61" name="Picture"/>
+                    <pic:cNvPr descr="multivariate_analysis_files/figure-docx/fig-%20prediction%20intervals%20for%20mv_mlma%20split%20by%20warm.cool-%20cubic%20models-2.png" id="51" name="Picture"/>
                     <pic:cNvPicPr>
                       <a:picLocks noChangeArrowheads="1" noChangeAspect="1"/>
                     </pic:cNvPicPr>
                   </pic:nvPicPr>
                   <pic:blipFill>
-                    <a:blip r:embed="rId59"/>
+                    <a:blip r:embed="rId49"/>
                     <a:stretch>
                       <a:fillRect/>
                     </a:stretch>
@@ -7912,8 +7755,89 @@
         <w:t xml:space="preserve">{#fig- prediction intervals for mv_mlma split by warm.cool- cubic models-2}</w:t>
       </w:r>
     </w:p>
-    <w:bookmarkEnd w:id="62"/>
-    <w:bookmarkStart w:id="69" w:name="Xfc5e2c30a9c968adeed1f068caaa50842238f90"/>
+    <w:tbl>
+      <w:tblPr>
+        <w:tblStyle w:val="Table"/>
+        <w:tblW w:type="pct" w:w="5000"/>
+        <w:tblLayout w:type="fixed"/>
+        <w:tblLook w:firstRow="0" w:lastRow="0" w:firstColumn="0" w:lastColumn="0" w:noHBand="0" w:noVBand="0" w:val="0000"/>
+      </w:tblPr>
+      <w:tblGrid>
+        <w:gridCol w:w="7920"/>
+      </w:tblGrid>
+      <w:tr>
+        <w:tc>
+          <w:tcPr/>
+          <w:bookmarkStart w:id="56" w:name="fig-prediction-intervals-warm-cool"/>
+          <w:p>
+            <w:pPr>
+              <w:pStyle w:val="Compact"/>
+              <w:jc w:val="center"/>
+            </w:pPr>
+            <w:bookmarkStart w:id="55" w:name="fig-prediction-intervals-warm-cool"/>
+            <w:r>
+              <w:drawing>
+                <wp:inline>
+                  <wp:extent cx="5334000" cy="4267200"/>
+                  <wp:effectExtent b="0" l="0" r="0" t="0"/>
+                  <wp:docPr descr="" title="" id="53" name="Picture"/>
+                  <a:graphic>
+                    <a:graphicData uri="http://schemas.openxmlformats.org/drawingml/2006/picture">
+                      <pic:pic>
+                        <pic:nvPicPr>
+                          <pic:cNvPr descr="multivariate_analysis_files/figure-docx/fig-prediction-intervals-warm-cool-1.png" id="54" name="Picture"/>
+                          <pic:cNvPicPr>
+                            <a:picLocks noChangeArrowheads="1" noChangeAspect="1"/>
+                          </pic:cNvPicPr>
+                        </pic:nvPicPr>
+                        <pic:blipFill>
+                          <a:blip r:embed="rId52"/>
+                          <a:stretch>
+                            <a:fillRect/>
+                          </a:stretch>
+                        </pic:blipFill>
+                        <pic:spPr bwMode="auto">
+                          <a:xfrm>
+                            <a:off x="0" y="0"/>
+                            <a:ext cx="5334000" cy="4267200"/>
+                          </a:xfrm>
+                          <a:prstGeom prst="rect">
+                            <a:avLst/>
+                          </a:prstGeom>
+                          <a:noFill/>
+                          <a:ln w="9525">
+                            <a:noFill/>
+                            <a:headEnd/>
+                            <a:tailEnd/>
+                          </a:ln>
+                        </pic:spPr>
+                      </pic:pic>
+                    </a:graphicData>
+                  </a:graphic>
+                </wp:inline>
+              </w:drawing>
+            </w:r>
+            <w:bookmarkEnd w:id="55"/>
+          </w:p>
+          <w:p>
+            <w:pPr>
+              <w:jc w:val="center"/>
+            </w:pPr>
+            <w:pPr>
+              <w:jc w:val="start"/>
+              <w:spacing w:before="200"/>
+              <w:pStyle w:val="ImageCaption"/>
+            </w:pPr>
+            <w:r>
+              <w:t xml:space="preserve">Figure 5</w:t>
+            </w:r>
+          </w:p>
+          <w:bookmarkEnd w:id="56"/>
+        </w:tc>
+      </w:tr>
+    </w:tbl>
+    <w:bookmarkEnd w:id="57"/>
+    <w:bookmarkStart w:id="64" w:name="Xfc5e2c30a9c968adeed1f068caaa50842238f90"/>
     <w:p>
       <w:pPr>
         <w:pStyle w:val="Heading1"/>
@@ -7922,7 +7846,7 @@
         <w:t xml:space="preserve">Sensitivity analysis- Robust variance estimation</w:t>
       </w:r>
     </w:p>
-    <w:bookmarkStart w:id="63" w:name="sensitivity-analysis--removing-outliers"/>
+    <w:bookmarkStart w:id="58" w:name="sensitivity-analysis--removing-outliers"/>
     <w:p>
       <w:pPr>
         <w:pStyle w:val="Heading3"/>
@@ -7931,8 +7855,8 @@
         <w:t xml:space="preserve">Sensitivity analysis- removing outliers</w:t>
       </w:r>
     </w:p>
-    <w:bookmarkEnd w:id="63"/>
-    <w:bookmarkStart w:id="65" w:name="warm-subset"/>
+    <w:bookmarkEnd w:id="58"/>
+    <w:bookmarkStart w:id="60" w:name="warm-subset"/>
     <w:p>
       <w:pPr>
         <w:pStyle w:val="Heading3"/>
@@ -7954,7 +7878,7 @@
       <w:tr>
         <w:tc>
           <w:tcPr/>
-          <w:bookmarkStart w:id="64" w:name="tbl-warm-lin-sa"/>
+          <w:bookmarkStart w:id="59" w:name="tbl-warm-lin-sa"/>
           <w:p>
             <w:pPr>
               <w:jc w:val="center"/>
@@ -9597,7 +9521,7 @@
               </w:tc>
             </w:tr>
           </w:tbl>
-          <w:bookmarkEnd w:id="64"/>
+          <w:bookmarkEnd w:id="59"/>
         </w:tc>
       </w:tr>
     </w:tbl>
@@ -9609,8 +9533,8 @@
         <w:t xml:space="preserve">We found weaker, but qualitatively similar correlations, after removing outliers (between-study correlation = 0.47, 95% CI: 0.27 to 0.63 within-study correlation= 0.46, 95% CI: 0.32 to 0.59)</w:t>
       </w:r>
     </w:p>
-    <w:bookmarkEnd w:id="65"/>
-    <w:bookmarkStart w:id="67" w:name="cool-subset"/>
+    <w:bookmarkEnd w:id="60"/>
+    <w:bookmarkStart w:id="62" w:name="cool-subset"/>
     <w:p>
       <w:pPr>
         <w:pStyle w:val="Heading3"/>
@@ -9632,7 +9556,7 @@
       <w:tr>
         <w:tc>
           <w:tcPr/>
-          <w:bookmarkStart w:id="66" w:name="tbl-cool-quad-sa"/>
+          <w:bookmarkStart w:id="61" w:name="tbl-cool-quad-sa"/>
           <w:p>
             <w:pPr>
               <w:jc w:val="center"/>
@@ -11923,7 +11847,7 @@
               </w:tc>
             </w:tr>
           </w:tbl>
-          <w:bookmarkEnd w:id="66"/>
+          <w:bookmarkEnd w:id="61"/>
         </w:tc>
       </w:tr>
     </w:tbl>
@@ -11935,8 +11859,8 @@
         <w:t xml:space="preserve">We found qualitatively similar correlations, after removing outliers (between-study correlation = -0.03, 95% CI: -0.24 to 0.19 within-study correlation= -0.15, 95% CI: -0.29 to 0)</w:t>
       </w:r>
     </w:p>
-    <w:bookmarkEnd w:id="67"/>
-    <w:bookmarkStart w:id="68" w:name="X3e4a0d7eddb96e34c843a1cc1f6073881ce88b2"/>
+    <w:bookmarkEnd w:id="62"/>
+    <w:bookmarkStart w:id="63" w:name="X3e4a0d7eddb96e34c843a1cc1f6073881ce88b2"/>
     <w:p>
       <w:pPr>
         <w:pStyle w:val="Heading3"/>
@@ -11945,9 +11869,9 @@
         <w:t xml:space="preserve">Sensitivity analysis- chronic exposure only</w:t>
       </w:r>
     </w:p>
-    <w:bookmarkEnd w:id="68"/>
-    <w:bookmarkEnd w:id="69"/>
-    <w:bookmarkStart w:id="70" w:name="warm-subset-1"/>
+    <w:bookmarkEnd w:id="63"/>
+    <w:bookmarkEnd w:id="64"/>
+    <w:bookmarkStart w:id="65" w:name="warm-subset-1"/>
     <w:p>
       <w:pPr>
         <w:pStyle w:val="Heading1"/>
@@ -11956,8 +11880,8 @@
         <w:t xml:space="preserve">Warm subset</w:t>
       </w:r>
     </w:p>
-    <w:bookmarkEnd w:id="70"/>
-    <w:bookmarkStart w:id="95" w:name="cool-subset-1"/>
+    <w:bookmarkEnd w:id="65"/>
+    <w:bookmarkStart w:id="90" w:name="cool-subset-1"/>
     <w:p>
       <w:pPr>
         <w:pStyle w:val="Heading1"/>
@@ -11966,7 +11890,7 @@
         <w:t xml:space="preserve">Cool subset</w:t>
       </w:r>
     </w:p>
-    <w:bookmarkStart w:id="89" w:name="higher-order-polynomials"/>
+    <w:bookmarkStart w:id="84" w:name="higher-order-polynomials"/>
     <w:p>
       <w:pPr>
         <w:pStyle w:val="Heading3"/>
@@ -11984,18 +11908,18 @@
           <wp:inline>
             <wp:extent cx="5334000" cy="4267200"/>
             <wp:effectExtent b="0" l="0" r="0" t="0"/>
-            <wp:docPr descr="" title="" id="72" name="Picture"/>
+            <wp:docPr descr="" title="" id="67" name="Picture"/>
             <a:graphic>
               <a:graphicData uri="http://schemas.openxmlformats.org/drawingml/2006/picture">
                 <pic:pic>
                   <pic:nvPicPr>
-                    <pic:cNvPr descr="multivariate_analysis_files/figure-docx/plot-highorder-polynomials-1.png" id="73" name="Picture"/>
+                    <pic:cNvPr descr="multivariate_analysis_files/figure-docx/plot-highorder-polynomials-1.png" id="68" name="Picture"/>
                     <pic:cNvPicPr>
                       <a:picLocks noChangeArrowheads="1" noChangeAspect="1"/>
                     </pic:cNvPicPr>
                   </pic:nvPicPr>
                   <pic:blipFill>
-                    <a:blip r:embed="rId71"/>
+                    <a:blip r:embed="rId66"/>
                     <a:stretch>
                       <a:fillRect/>
                     </a:stretch>
@@ -12031,18 +11955,18 @@
           <wp:inline>
             <wp:extent cx="5334000" cy="4267200"/>
             <wp:effectExtent b="0" l="0" r="0" t="0"/>
-            <wp:docPr descr="" title="" id="75" name="Picture"/>
+            <wp:docPr descr="" title="" id="70" name="Picture"/>
             <a:graphic>
               <a:graphicData uri="http://schemas.openxmlformats.org/drawingml/2006/picture">
                 <pic:pic>
                   <pic:nvPicPr>
-                    <pic:cNvPr descr="multivariate_analysis_files/figure-docx/plot-highorder-polynomials-2.png" id="76" name="Picture"/>
+                    <pic:cNvPr descr="multivariate_analysis_files/figure-docx/plot-highorder-polynomials-2.png" id="71" name="Picture"/>
                     <pic:cNvPicPr>
                       <a:picLocks noChangeArrowheads="1" noChangeAspect="1"/>
                     </pic:cNvPicPr>
                   </pic:nvPicPr>
                   <pic:blipFill>
-                    <a:blip r:embed="rId74"/>
+                    <a:blip r:embed="rId69"/>
                     <a:stretch>
                       <a:fillRect/>
                     </a:stretch>
@@ -12078,18 +12002,18 @@
           <wp:inline>
             <wp:extent cx="5334000" cy="4267200"/>
             <wp:effectExtent b="0" l="0" r="0" t="0"/>
-            <wp:docPr descr="" title="" id="78" name="Picture"/>
+            <wp:docPr descr="" title="" id="73" name="Picture"/>
             <a:graphic>
               <a:graphicData uri="http://schemas.openxmlformats.org/drawingml/2006/picture">
                 <pic:pic>
                   <pic:nvPicPr>
-                    <pic:cNvPr descr="multivariate_analysis_files/figure-docx/plot-highorder-polynomials-3.png" id="79" name="Picture"/>
+                    <pic:cNvPr descr="multivariate_analysis_files/figure-docx/plot-highorder-polynomials-3.png" id="74" name="Picture"/>
                     <pic:cNvPicPr>
                       <a:picLocks noChangeArrowheads="1" noChangeAspect="1"/>
                     </pic:cNvPicPr>
                   </pic:nvPicPr>
                   <pic:blipFill>
-                    <a:blip r:embed="rId77"/>
+                    <a:blip r:embed="rId72"/>
                     <a:stretch>
                       <a:fillRect/>
                     </a:stretch>
@@ -12125,18 +12049,18 @@
           <wp:inline>
             <wp:extent cx="5334000" cy="4267200"/>
             <wp:effectExtent b="0" l="0" r="0" t="0"/>
-            <wp:docPr descr="" title="" id="81" name="Picture"/>
+            <wp:docPr descr="" title="" id="76" name="Picture"/>
             <a:graphic>
               <a:graphicData uri="http://schemas.openxmlformats.org/drawingml/2006/picture">
                 <pic:pic>
                   <pic:nvPicPr>
-                    <pic:cNvPr descr="multivariate_analysis_files/figure-docx/plot-highorder-polynomials-4.png" id="82" name="Picture"/>
+                    <pic:cNvPr descr="multivariate_analysis_files/figure-docx/plot-highorder-polynomials-4.png" id="77" name="Picture"/>
                     <pic:cNvPicPr>
                       <a:picLocks noChangeArrowheads="1" noChangeAspect="1"/>
                     </pic:cNvPicPr>
                   </pic:nvPicPr>
                   <pic:blipFill>
-                    <a:blip r:embed="rId80"/>
+                    <a:blip r:embed="rId75"/>
                     <a:stretch>
                       <a:fillRect/>
                     </a:stretch>
@@ -12172,18 +12096,18 @@
           <wp:inline>
             <wp:extent cx="5334000" cy="4267200"/>
             <wp:effectExtent b="0" l="0" r="0" t="0"/>
-            <wp:docPr descr="" title="" id="84" name="Picture"/>
+            <wp:docPr descr="" title="" id="79" name="Picture"/>
             <a:graphic>
               <a:graphicData uri="http://schemas.openxmlformats.org/drawingml/2006/picture">
                 <pic:pic>
                   <pic:nvPicPr>
-                    <pic:cNvPr descr="multivariate_analysis_files/figure-docx/plot-highorder-polynomials-5.png" id="85" name="Picture"/>
+                    <pic:cNvPr descr="multivariate_analysis_files/figure-docx/plot-highorder-polynomials-5.png" id="80" name="Picture"/>
                     <pic:cNvPicPr>
                       <a:picLocks noChangeArrowheads="1" noChangeAspect="1"/>
                     </pic:cNvPicPr>
                   </pic:nvPicPr>
                   <pic:blipFill>
-                    <a:blip r:embed="rId83"/>
+                    <a:blip r:embed="rId78"/>
                     <a:stretch>
                       <a:fillRect/>
                     </a:stretch>
@@ -12219,18 +12143,18 @@
           <wp:inline>
             <wp:extent cx="5334000" cy="4267200"/>
             <wp:effectExtent b="0" l="0" r="0" t="0"/>
-            <wp:docPr descr="" title="" id="87" name="Picture"/>
+            <wp:docPr descr="" title="" id="82" name="Picture"/>
             <a:graphic>
               <a:graphicData uri="http://schemas.openxmlformats.org/drawingml/2006/picture">
                 <pic:pic>
                   <pic:nvPicPr>
-                    <pic:cNvPr descr="multivariate_analysis_files/figure-docx/plot-highorder-polynomials-6.png" id="88" name="Picture"/>
+                    <pic:cNvPr descr="multivariate_analysis_files/figure-docx/plot-highorder-polynomials-6.png" id="83" name="Picture"/>
                     <pic:cNvPicPr>
                       <a:picLocks noChangeArrowheads="1" noChangeAspect="1"/>
                     </pic:cNvPicPr>
                   </pic:nvPicPr>
                   <pic:blipFill>
-                    <a:blip r:embed="rId86"/>
+                    <a:blip r:embed="rId81"/>
                     <a:stretch>
                       <a:fillRect/>
                     </a:stretch>
@@ -12257,8 +12181,8 @@
         </w:drawing>
       </w:r>
     </w:p>
-    <w:bookmarkEnd w:id="89"/>
-    <w:bookmarkStart w:id="94" w:name="pest-sub-analysis"/>
+    <w:bookmarkEnd w:id="84"/>
+    <w:bookmarkStart w:id="89" w:name="pest-sub-analysis"/>
     <w:p>
       <w:pPr>
         <w:pStyle w:val="Heading3"/>
@@ -12280,7 +12204,7 @@
       <w:tr>
         <w:tc>
           <w:tcPr/>
-          <w:bookmarkStart w:id="90" w:name="tbl-warm-rm-aq"/>
+          <w:bookmarkStart w:id="85" w:name="tbl-warm-rm-aq"/>
           <w:p>
             <w:pPr>
               <w:jc w:val="center"/>
@@ -14571,7 +14495,7 @@
               </w:tc>
             </w:tr>
           </w:tbl>
-          <w:bookmarkEnd w:id="90"/>
+          <w:bookmarkEnd w:id="85"/>
         </w:tc>
       </w:tr>
     </w:tbl>
@@ -14588,7 +14512,7 @@
       <w:tr>
         <w:tc>
           <w:tcPr/>
-          <w:bookmarkStart w:id="91" w:name="tbl-cool-rm-aq"/>
+          <w:bookmarkStart w:id="86" w:name="tbl-cool-rm-aq"/>
           <w:p>
             <w:pPr>
               <w:jc w:val="center"/>
@@ -16879,7 +16803,7 @@
               </w:tc>
             </w:tr>
           </w:tbl>
-          <w:bookmarkEnd w:id="91"/>
+          <w:bookmarkEnd w:id="86"/>
         </w:tc>
       </w:tr>
     </w:tbl>
@@ -16896,7 +16820,7 @@
       <w:tr>
         <w:tc>
           <w:tcPr/>
-          <w:bookmarkStart w:id="92" w:name="tbl-warm-rm-rear"/>
+          <w:bookmarkStart w:id="87" w:name="tbl-warm-rm-rear"/>
           <w:p>
             <w:pPr>
               <w:jc w:val="center"/>
@@ -19187,7 +19111,7 @@
               </w:tc>
             </w:tr>
           </w:tbl>
-          <w:bookmarkEnd w:id="92"/>
+          <w:bookmarkEnd w:id="87"/>
         </w:tc>
       </w:tr>
     </w:tbl>
@@ -19204,7 +19128,7 @@
       <w:tr>
         <w:tc>
           <w:tcPr/>
-          <w:bookmarkStart w:id="93" w:name="tbl-cool-rm-rear"/>
+          <w:bookmarkStart w:id="88" w:name="tbl-cool-rm-rear"/>
           <w:p>
             <w:pPr>
               <w:jc w:val="center"/>
@@ -21495,12 +21419,12 @@
               </w:tc>
             </w:tr>
           </w:tbl>
-          <w:bookmarkEnd w:id="93"/>
+          <w:bookmarkEnd w:id="88"/>
         </w:tc>
       </w:tr>
     </w:tbl>
-    <w:bookmarkEnd w:id="94"/>
-    <w:bookmarkEnd w:id="95"/>
+    <w:bookmarkEnd w:id="89"/>
+    <w:bookmarkEnd w:id="90"/>
     <w:sectPr/>
   </w:body>
 </w:document>

</xml_diff>